<commit_message>
doc gen feature working successfully
</commit_message>
<xml_diff>
--- a/backend/app/services/generated_docs/remand_request_CASE001.docx
+++ b/backend/app/services/generated_docs/remand_request_CASE001.docx
@@ -47,12 +47,12 @@
     </w:p>
     <w:p>
       <w:r>
-        <w:t>1. The accused was arrested on 11/07/2026 at [HH:MM] hours in connection with FIR No: Court No. 3/[Year] registered under Sections Sec 1 BNS, Sec 2 BNS of BNS.</w:t>
-      </w:r>
-    </w:p>
-    <w:p>
-      <w:r>
-        <w:t>2. The mandatory 24 hours from arrest expire on 11/07/2026 at [HH:MM].</w:t>
+        <w:t>1. The accused was arrested on 16/07/2026 at [HH:MM] hours in connection with FIR No: Court No. 3/[Year] registered under Sections Sec 1 BNS, Sec 2 BNS of BNS.</w:t>
+      </w:r>
+    </w:p>
+    <w:p>
+      <w:r>
+        <w:t>2. The mandatory 24 hours from arrest expire on 16/07/2026 at [HH:MM].</w:t>
       </w:r>
     </w:p>
     <w:p>
@@ -94,7 +94,7 @@
     <w:p/>
     <w:p>
       <w:r>
-        <w:t>Date: 11/07/2026                    Signature: __________________________</w:t>
+        <w:t>Date: 16/07/2026                    Signature: __________________________</w:t>
       </w:r>
     </w:p>
     <w:p>

</xml_diff>